<commit_message>
Move communication strength bullet down
</commit_message>
<xml_diff>
--- a/Antonio_Colomba_Fast_Resume.docx
+++ b/Antonio_Colomba_Fast_Resume.docx
@@ -135,23 +135,6 @@
           <w:color w:val="1F2933"/>
           <w:sz w:val="18"/>
         </w:rPr>
-        <w:t>Calm written communication, organized follow-up, and careful handling of details.</w:t>
-      </w:r>
-    </w:p>
-    <w:p>
-      <w:pPr>
-        <w:pStyle w:val="ListBullet"/>
-        <w:spacing w:before="0" w:after="60" w:line="259" w:lineRule="auto"/>
-        <w:ind w:left="259" w:right="0"/>
-      </w:pPr>
-      <w:r>
-        <w:rPr>
-          <w:rFonts w:ascii="Aptos" w:hAnsi="Aptos" w:eastAsia="Aptos"/>
-          <w:b w:val="0"/>
-          <w:i w:val="0"/>
-          <w:color w:val="1F2933"/>
-          <w:sz w:val="18"/>
-        </w:rPr>
         <w:t>Reliable with structured work, checklists, file organization, customer communication, and production standards.</w:t>
       </w:r>
     </w:p>
@@ -187,6 +170,23 @@
           <w:sz w:val="18"/>
         </w:rPr>
         <w:t>Ready to support ticket handling, research, CRM updates, data entry, order/admin support, inventory checklists, and AI-assisted workflows.</w:t>
+      </w:r>
+    </w:p>
+    <w:p>
+      <w:pPr>
+        <w:pStyle w:val="ListBullet"/>
+        <w:spacing w:before="0" w:after="60" w:line="259" w:lineRule="auto"/>
+        <w:ind w:left="259" w:right="0"/>
+      </w:pPr>
+      <w:r>
+        <w:rPr>
+          <w:rFonts w:ascii="Aptos" w:hAnsi="Aptos" w:eastAsia="Aptos"/>
+          <w:b w:val="0"/>
+          <w:i w:val="0"/>
+          <w:color w:val="1F2933"/>
+          <w:sz w:val="18"/>
+        </w:rPr>
+        <w:t>Calm written communication, organized follow-up, and careful handling of details.</w:t>
       </w:r>
     </w:p>
     <w:p>

</xml_diff>

<commit_message>
Remove broad tools section
</commit_message>
<xml_diff>
--- a/Antonio_Colomba_Fast_Resume.docx
+++ b/Antonio_Colomba_Fast_Resume.docx
@@ -508,32 +508,6 @@
     </w:p>
     <w:p>
       <w:pPr>
-        <w:spacing w:before="40" w:after="140" w:line="259" w:lineRule="auto"/>
-        <w:ind w:left="0" w:right="0"/>
-      </w:pPr>
-      <w:r>
-        <w:rPr>
-          <w:rFonts w:ascii="Aptos" w:hAnsi="Aptos" w:eastAsia="Aptos"/>
-          <w:b/>
-          <w:i w:val="0"/>
-          <w:color w:val="0F766E"/>
-          <w:sz w:val="17"/>
-        </w:rPr>
-        <w:t xml:space="preserve">Tools: </w:t>
-      </w:r>
-      <w:r>
-        <w:rPr>
-          <w:rFonts w:ascii="Aptos" w:hAnsi="Aptos" w:eastAsia="Aptos"/>
-          <w:b w:val="0"/>
-          <w:i w:val="0"/>
-          <w:color w:val="5B6673"/>
-          <w:sz w:val="17"/>
-        </w:rPr>
-        <w:t>Photoshop, InDesign, Premiere, After Effects, Nuke, Maya, Houdini, Mac, Windows, Linux, troubleshooting, documentation, spreadsheets, AI-assisted workflows, Higgsfield, generative media workflows, Next.js, TypeScript, Python basics, crypto/product research.</w:t>
-      </w:r>
-    </w:p>
-    <w:p>
-      <w:pPr>
         <w:spacing w:before="200" w:after="100" w:line="240" w:lineRule="auto"/>
         <w:ind w:left="0" w:right="0"/>
       </w:pPr>

</xml_diff>

<commit_message>
Clarify DMAC Lynn education wording
</commit_message>
<xml_diff>
--- a/Antonio_Colomba_Fast_Resume.docx
+++ b/Antonio_Colomba_Fast_Resume.docx
@@ -545,7 +545,7 @@
           <w:color w:val="1F2933"/>
           <w:sz w:val="17"/>
         </w:rPr>
-        <w:t>Digital Media Arts College</w:t>
+        <w:t>Digital Media Arts College, now part of Lynn University</w:t>
       </w:r>
       <w:r>
         <w:rPr>
@@ -587,7 +587,7 @@
           <w:color w:val="1F2933"/>
           <w:sz w:val="17"/>
         </w:rPr>
-        <w:t>Digital Media Arts College</w:t>
+        <w:t>Digital Media Arts College, now part of Lynn University</w:t>
       </w:r>
       <w:r>
         <w:rPr>

</xml_diff>

<commit_message>
Clean up resume role wording
</commit_message>
<xml_diff>
--- a/Antonio_Colomba_Fast_Resume.docx
+++ b/Antonio_Colomba_Fast_Resume.docx
@@ -153,40 +153,6 @@
           <w:sz w:val="18"/>
         </w:rPr>
         <w:t>Comfortable learning software tools, troubleshooting issues, documenting process, and following workplace procedures.</w:t>
-      </w:r>
-    </w:p>
-    <w:p>
-      <w:pPr>
-        <w:pStyle w:val="ListBullet"/>
-        <w:spacing w:before="0" w:after="60" w:line="259" w:lineRule="auto"/>
-        <w:ind w:left="259" w:right="0"/>
-      </w:pPr>
-      <w:r>
-        <w:rPr>
-          <w:rFonts w:ascii="Aptos" w:hAnsi="Aptos" w:eastAsia="Aptos"/>
-          <w:b w:val="0"/>
-          <w:i w:val="0"/>
-          <w:color w:val="1F2933"/>
-          <w:sz w:val="18"/>
-        </w:rPr>
-        <w:t>Ready to support ticket handling, research, CRM updates, data entry, order/admin support, inventory checklists, and AI-assisted workflows.</w:t>
-      </w:r>
-    </w:p>
-    <w:p>
-      <w:pPr>
-        <w:pStyle w:val="ListBullet"/>
-        <w:spacing w:before="0" w:after="60" w:line="259" w:lineRule="auto"/>
-        <w:ind w:left="259" w:right="0"/>
-      </w:pPr>
-      <w:r>
-        <w:rPr>
-          <w:rFonts w:ascii="Aptos" w:hAnsi="Aptos" w:eastAsia="Aptos"/>
-          <w:b w:val="0"/>
-          <w:i w:val="0"/>
-          <w:color w:val="1F2933"/>
-          <w:sz w:val="18"/>
-        </w:rPr>
-        <w:t>Calm written communication, organized follow-up, and careful handling of details.</w:t>
       </w:r>
     </w:p>
     <w:p>

</xml_diff>